<commit_message>
docs(guide): tester guide v2.0 covers running a Postman collection in Baseline11
Adds section 1 (the recommended collection wizard: files, variables,
scope and review, progress, results, failure codes) with screenshots
captured by frontend/scripts/capture-guide-screenshots.mjs, and marks
manual Newman reports as the advanced mode. The builder now reads
screenshots from reports/assets instead of temporary clipboard files,
resolves paths relative to itself, and starts chapters via the
Heading 1 style so no blank pages appear. Completes spec Phase 6.
</commit_message>
<xml_diff>
--- a/reports/Baseline11_Auto_Correlation_Tester_Guide.docx
+++ b/reports/Baseline11_Auto_Correlation_Tester_Guide.docx
@@ -34,7 +34,7 @@
         <w:t xml:space="preserve">Purpose. </w:t>
       </w:r>
       <w:r>
-        <w:t>This guide explains how a tester uses Baseline11 Auto Correlate to execute a working Postman collection twice with Newman, upload the resulting JSON reports, confirm dynamic producer and consumer relationships, generate a correlated JMX, and validate it with Apache JMeter.</w:t>
+        <w:t>This guide explains how a tester uses Baseline11 Auto Correlate to run a working Postman collection twice, confirm dynamic producer and consumer relationships, generate a correlated JMX, and validate it with Apache JMeter. Baseline11 can run the collection itself in isolated Newman containers (recommended), or accept two Newman JSON reports the tester already captured (advanced).</w:t>
       </w:r>
     </w:p>
     <w:p>
@@ -247,7 +247,7 @@
               <w:rPr>
                 <w:sz w:val="18"/>
               </w:rPr>
-              <w:t>1.0</w:t>
+              <w:t>2.0</w:t>
             </w:r>
           </w:p>
         </w:tc>
@@ -270,7 +270,7 @@
               <w:rPr>
                 <w:sz w:val="18"/>
               </w:rPr>
-              <w:t>23 September 2026</w:t>
+              <w:t>25 September 2026</w:t>
             </w:r>
           </w:p>
         </w:tc>
@@ -295,7 +295,7 @@
         <w:spacing w:after="40"/>
       </w:pPr>
       <w:r>
-        <w:t>A Postman collection that already executes successfully.</w:t>
+        <w:t>A Postman collection that already executes successfully against public HTTPS endpoints.</w:t>
       </w:r>
     </w:p>
     <w:p>
@@ -313,7 +313,7 @@
         <w:spacing w:after="40"/>
       </w:pPr>
       <w:r>
-        <w:t>Newman and the optional htmlextra reporter.</w:t>
+        <w:t>Access to the Baseline11 Auto Correlate web application and Apache JMeter 5.6.3.</w:t>
       </w:r>
     </w:p>
     <w:p>
@@ -322,21 +322,7 @@
         <w:spacing w:after="40"/>
       </w:pPr>
       <w:r>
-        <w:t>Two successful Newman JSON reports from the same collection and request order.</w:t>
-      </w:r>
-    </w:p>
-    <w:p>
-      <w:pPr>
-        <w:pStyle w:val="ListBullet"/>
-        <w:spacing w:after="40"/>
-      </w:pPr>
-      <w:r>
-        <w:t>Access to the Baseline11 Auto Correlate web application and Apache JMeter 5.6.3.</w:t>
-      </w:r>
-    </w:p>
-    <w:p>
-      <w:r>
-        <w:br w:type="page"/>
+        <w:t>Advanced mode only: Newman and two successful Newman JSON reports from the same collection and request order.</w:t>
       </w:r>
     </w:p>
     <w:p>
@@ -350,6 +336,14 @@
     <w:p>
       <w:r>
         <w:t>Use this page when the collection, environment and credentials are already prepared. The detailed procedure begins on the next page.</w:t>
+      </w:r>
+    </w:p>
+    <w:p>
+      <w:pPr>
+        <w:pStyle w:val="Heading2"/>
+      </w:pPr>
+      <w:r>
+        <w:t>Recommended: let Baseline11 run the collection</w:t>
       </w:r>
     </w:p>
     <w:tbl>
@@ -498,7 +492,7 @@
               <w:rPr>
                 <w:sz w:val="18"/>
               </w:rPr>
-              <w:t>Verify the collection</w:t>
+              <w:t>Choose mode</w:t>
             </w:r>
           </w:p>
         </w:tc>
@@ -521,7 +515,7 @@
               <w:rPr>
                 <w:sz w:val="18"/>
               </w:rPr>
-              <w:t>Run the selected folder in Postman or Newman and confirm that producer requests succeed.</w:t>
+              <w:t>Select Run a Postman collection.</w:t>
             </w:r>
           </w:p>
         </w:tc>
@@ -571,7 +565,7 @@
               <w:rPr>
                 <w:sz w:val="18"/>
               </w:rPr>
-              <w:t>Create baseline</w:t>
+              <w:t>Upload files</w:t>
             </w:r>
           </w:p>
         </w:tc>
@@ -595,7 +589,7 @@
               <w:rPr>
                 <w:sz w:val="18"/>
               </w:rPr>
-              <w:t>Run Newman and export baseline.json.</w:t>
+              <w:t>Add the collection and, optionally, its environment, then click Inspect collection. Nothing is sent to any API yet.</w:t>
             </w:r>
           </w:p>
         </w:tc>
@@ -643,7 +637,7 @@
               <w:rPr>
                 <w:sz w:val="18"/>
               </w:rPr>
-              <w:t>Create comparison</w:t>
+              <w:t>Supply variables</w:t>
             </w:r>
           </w:p>
         </w:tc>
@@ -666,7 +660,7 @@
               <w:rPr>
                 <w:sz w:val="18"/>
               </w:rPr>
-              <w:t>Run the same command again and export comparison.json.</w:t>
+              <w:t>Enter any values the collection needs that are not in the environment. Secrets stay hidden.</w:t>
             </w:r>
           </w:p>
         </w:tc>
@@ -716,7 +710,7 @@
               <w:rPr>
                 <w:sz w:val="18"/>
               </w:rPr>
-              <w:t>Upload</w:t>
+              <w:t>Review scope</w:t>
             </w:r>
           </w:p>
         </w:tc>
@@ -740,7 +734,7 @@
               <w:rPr>
                 <w:sz w:val="18"/>
               </w:rPr>
-              <w:t>Upload baseline first and comparison second.</w:t>
+              <w:t>Pick the whole collection or one folder, check the target domains, then click Run collection twice.</w:t>
             </w:r>
           </w:p>
         </w:tc>
@@ -788,7 +782,7 @@
               <w:rPr>
                 <w:sz w:val="18"/>
               </w:rPr>
-              <w:t>Review</w:t>
+              <w:t>Wait</w:t>
             </w:r>
           </w:p>
         </w:tc>
@@ -811,7 +805,7 @@
               <w:rPr>
                 <w:sz w:val="18"/>
               </w:rPr>
-              <w:t>Confirm healthy runs, aligned requests and the expected candidate.</w:t>
+              <w:t>Baseline11 runs the collection twice in isolated Newman containers and opens the analysis.</w:t>
             </w:r>
           </w:p>
         </w:tc>
@@ -885,7 +879,7 @@
               <w:rPr>
                 <w:sz w:val="18"/>
               </w:rPr>
-              <w:t>Click Auto correlate all reused values once.</w:t>
+              <w:t>Check Run Health, then click Auto correlate all reused values once.</w:t>
             </w:r>
           </w:p>
         </w:tc>
@@ -1046,6 +1040,19 @@
         <w:pStyle w:val="Heading2"/>
       </w:pPr>
       <w:r>
+        <w:t>Advanced: upload two Newman reports</w:t>
+      </w:r>
+    </w:p>
+    <w:p>
+      <w:r>
+        <w:t>Use this mode when the collection must run from a network Baseline11 cannot reach, such as a private test environment. Run Newman twice yourself (section 3), choose Upload existing Newman reports, upload baseline.json first and comparison.json second, then continue from step 6 above.</w:t>
+      </w:r>
+    </w:p>
+    <w:p>
+      <w:pPr>
+        <w:pStyle w:val="Heading2"/>
+      </w:pPr>
+      <w:r>
         <w:t>The Core Concept</w:t>
       </w:r>
     </w:p>
@@ -1132,16 +1139,1434 @@
       </w:r>
     </w:p>
     <w:p>
+      <w:pPr>
+        <w:pStyle w:val="Heading1"/>
+      </w:pPr>
       <w:r>
-        <w:br w:type="page"/>
+        <w:t>1 Run a Postman Collection in Baseline11 (Recommended)</w:t>
       </w:r>
+    </w:p>
+    <w:p>
+      <w:r>
+        <w:t>Baseline11 can execute the collection for you. It inspects the collection first, asks for any missing values, then runs it twice with Newman 6.2.2 in fresh isolated containers from identical starting values. Both reports go through exactly the same analysis as uploaded reports.</w:t>
+      </w:r>
+    </w:p>
+    <w:p>
+      <w:pPr>
+        <w:jc w:val="center"/>
+      </w:pPr>
+      <w:r>
+        <w:drawing>
+          <wp:inline xmlns:a="http://schemas.openxmlformats.org/drawingml/2006/main" xmlns:pic="http://schemas.openxmlformats.org/drawingml/2006/picture">
+            <wp:extent cx="5120640" cy="1400175"/>
+            <wp:docPr id="1" name="Picture 1" descr="Baseline11 start screen offering Run a Postman collection (recommended) or Upload existing Newman reports (advanced)"/>
+            <wp:cNvGraphicFramePr>
+              <a:graphicFrameLocks noChangeAspect="1"/>
+            </wp:cNvGraphicFramePr>
+            <a:graphic>
+              <a:graphicData uri="http://schemas.openxmlformats.org/drawingml/2006/picture">
+                <pic:pic>
+                  <pic:nvPicPr>
+                    <pic:cNvPr id="0" name="image.png"/>
+                    <pic:cNvPicPr/>
+                  </pic:nvPicPr>
+                  <pic:blipFill>
+                    <a:blip r:embed="rId10"/>
+                    <a:stretch>
+                      <a:fillRect/>
+                    </a:stretch>
+                  </pic:blipFill>
+                  <pic:spPr>
+                    <a:xfrm>
+                      <a:off x="0" y="0"/>
+                      <a:ext cx="5120640" cy="1400175"/>
+                    </a:xfrm>
+                    <a:prstGeom prst="rect"/>
+                  </pic:spPr>
+                </pic:pic>
+              </a:graphicData>
+            </a:graphic>
+          </wp:inline>
+        </w:drawing>
+      </w:r>
+    </w:p>
+    <w:p>
+      <w:pPr>
+        <w:spacing w:before="60" w:after="180"/>
+        <w:jc w:val="center"/>
+      </w:pPr>
+      <w:r>
+        <w:rPr>
+          <w:i/>
+          <w:color w:val="555555"/>
+          <w:sz w:val="17"/>
+        </w:rPr>
+        <w:t>Figure 1  Choose Run a Postman collection</w:t>
+      </w:r>
+    </w:p>
+    <w:p>
+      <w:pPr>
+        <w:pStyle w:val="Heading2"/>
+      </w:pPr>
+      <w:r>
+        <w:t>Step 1  Files</w:t>
+      </w:r>
+    </w:p>
+    <w:p>
+      <w:r>
+        <w:t>Add the exported collection (.postman_collection.json) and, if the collection uses one, the environment (.postman_environment.json). Click Inspect collection. Inspection reads the files only; no request is sent to any API.</w:t>
+      </w:r>
+    </w:p>
+    <w:p>
+      <w:pPr>
+        <w:pStyle w:val="Heading2"/>
+      </w:pPr>
+      <w:r>
+        <w:t>Step 2  Variables</w:t>
+      </w:r>
+    </w:p>
+    <w:p>
+      <w:r>
+        <w:t>Baseline11 lists every variable the collection uses and where each one comes from: the environment file, a Postman built-in such as $guid, or a script in the collection that sets it at runtime. Variables with no source must be supplied before the run can start; values are never silently replaced with empty strings. Secret-looking variables are masked and are never written to logs, job status, errors or the generated JMX.</w:t>
+      </w:r>
+    </w:p>
+    <w:p>
+      <w:pPr>
+        <w:jc w:val="center"/>
+      </w:pPr>
+      <w:r>
+        <w:drawing>
+          <wp:inline xmlns:a="http://schemas.openxmlformats.org/drawingml/2006/main" xmlns:pic="http://schemas.openxmlformats.org/drawingml/2006/picture">
+            <wp:extent cx="5120640" cy="2640330"/>
+            <wp:docPr id="2" name="Picture 2" descr="Variables step asking for a hidden api_key and listing three variables already resolved"/>
+            <wp:cNvGraphicFramePr>
+              <a:graphicFrameLocks noChangeAspect="1"/>
+            </wp:cNvGraphicFramePr>
+            <a:graphic>
+              <a:graphicData uri="http://schemas.openxmlformats.org/drawingml/2006/picture">
+                <pic:pic>
+                  <pic:nvPicPr>
+                    <pic:cNvPr id="0" name="image.png"/>
+                    <pic:cNvPicPr/>
+                  </pic:nvPicPr>
+                  <pic:blipFill>
+                    <a:blip r:embed="rId11"/>
+                    <a:stretch>
+                      <a:fillRect/>
+                    </a:stretch>
+                  </pic:blipFill>
+                  <pic:spPr>
+                    <a:xfrm>
+                      <a:off x="0" y="0"/>
+                      <a:ext cx="5120640" cy="2640330"/>
+                    </a:xfrm>
+                    <a:prstGeom prst="rect"/>
+                  </pic:spPr>
+                </pic:pic>
+              </a:graphicData>
+            </a:graphic>
+          </wp:inline>
+        </w:drawing>
+      </w:r>
+    </w:p>
+    <w:p>
+      <w:pPr>
+        <w:spacing w:before="60" w:after="180"/>
+        <w:jc w:val="center"/>
+      </w:pPr>
+      <w:r>
+        <w:rPr>
+          <w:i/>
+          <w:color w:val="555555"/>
+          <w:sz w:val="17"/>
+        </w:rPr>
+        <w:t>Figure 2  Supply missing values; resolved variables show their source</w:t>
+      </w:r>
+    </w:p>
+    <w:p>
+      <w:pPr>
+        <w:pStyle w:val="Heading2"/>
+      </w:pPr>
+      <w:r>
+        <w:t>Step 3  Scope and review</w:t>
+      </w:r>
+    </w:p>
+    <w:p>
+      <w:r>
+        <w:t>Pick the whole collection or a single folder, then check the summary: request count, target domains, the values you supplied and the execution limits. Click Run collection twice. Repeated clicks do not start duplicate jobs.</w:t>
+      </w:r>
+    </w:p>
+    <w:p>
+      <w:pPr>
+        <w:jc w:val="center"/>
+      </w:pPr>
+      <w:r>
+        <w:drawing>
+          <wp:inline xmlns:a="http://schemas.openxmlformats.org/drawingml/2006/main" xmlns:pic="http://schemas.openxmlformats.org/drawingml/2006/picture">
+            <wp:extent cx="5120640" cy="2808351"/>
+            <wp:docPr id="3" name="Picture 3" descr="Scope and review step showing collection, environment, three requests, target domain postman-echo.com and execution limits"/>
+            <wp:cNvGraphicFramePr>
+              <a:graphicFrameLocks noChangeAspect="1"/>
+            </wp:cNvGraphicFramePr>
+            <a:graphic>
+              <a:graphicData uri="http://schemas.openxmlformats.org/drawingml/2006/picture">
+                <pic:pic>
+                  <pic:nvPicPr>
+                    <pic:cNvPr id="0" name="image.png"/>
+                    <pic:cNvPicPr/>
+                  </pic:nvPicPr>
+                  <pic:blipFill>
+                    <a:blip r:embed="rId12"/>
+                    <a:stretch>
+                      <a:fillRect/>
+                    </a:stretch>
+                  </pic:blipFill>
+                  <pic:spPr>
+                    <a:xfrm>
+                      <a:off x="0" y="0"/>
+                      <a:ext cx="5120640" cy="2808351"/>
+                    </a:xfrm>
+                    <a:prstGeom prst="rect"/>
+                  </pic:spPr>
+                </pic:pic>
+              </a:graphicData>
+            </a:graphic>
+          </wp:inline>
+        </w:drawing>
+      </w:r>
+    </w:p>
+    <w:p>
+      <w:pPr>
+        <w:spacing w:before="60" w:after="180"/>
+        <w:jc w:val="center"/>
+      </w:pPr>
+      <w:r>
+        <w:rPr>
+          <w:i/>
+          <w:color w:val="555555"/>
+          <w:sz w:val="17"/>
+        </w:rPr>
+        <w:t>Figure 3  Confirm what will run before anything is sent</w:t>
+      </w:r>
+    </w:p>
+    <w:tbl>
+      <w:tblPr>
+        <w:tblW w:type="auto" w:w="0"/>
+        <w:jc w:val="center"/>
+        <w:tblLayout w:type="fixed"/>
+        <w:tblLook w:firstColumn="1" w:firstRow="1" w:lastColumn="0" w:lastRow="0" w:noHBand="0" w:noVBand="1" w:val="04A0"/>
+        <w:tblBorders>
+          <w:top w:val="single" w:sz="6" w:color="D9D9D9"/>
+          <w:left w:val="single" w:sz="6" w:color="D9D9D9"/>
+          <w:bottom w:val="single" w:sz="6" w:color="D9D9D9"/>
+          <w:right w:val="single" w:sz="6" w:color="D9D9D9"/>
+          <w:insideH w:val="single" w:sz="6" w:color="D9D9D9"/>
+          <w:insideV w:val="single" w:sz="6" w:color="D9D9D9"/>
+        </w:tblBorders>
+      </w:tblPr>
+      <w:tblGrid>
+        <w:gridCol w:w="3360"/>
+        <w:gridCol w:w="3360"/>
+        <w:gridCol w:w="3360"/>
+      </w:tblGrid>
+      <w:tr>
+        <w:trPr>
+          <w:tblHeader w:val="true"/>
+        </w:trPr>
+        <w:tc>
+          <w:tcPr>
+            <w:tcW w:type="dxa" w:w="1728"/>
+            <w:shd w:fill="17365D"/>
+            <w:vAlign w:val="center"/>
+            <w:tcMar>
+              <w:top w:w="110" w:type="dxa"/>
+              <w:start w:w="120" w:type="dxa"/>
+              <w:bottom w:w="110" w:type="dxa"/>
+              <w:end w:w="120" w:type="dxa"/>
+            </w:tcMar>
+          </w:tcPr>
+          <w:p>
+            <w:pPr>
+              <w:jc w:val="center"/>
+            </w:pPr>
+            <w:r>
+              <w:rPr>
+                <w:b/>
+                <w:color w:val="FFFFFF"/>
+                <w:sz w:val="18"/>
+              </w:rPr>
+              <w:t>Limit</w:t>
+            </w:r>
+          </w:p>
+        </w:tc>
+        <w:tc>
+          <w:tcPr>
+            <w:tcW w:type="dxa" w:w="3240"/>
+            <w:shd w:fill="17365D"/>
+            <w:vAlign w:val="center"/>
+            <w:tcMar>
+              <w:top w:w="110" w:type="dxa"/>
+              <w:start w:w="120" w:type="dxa"/>
+              <w:bottom w:w="110" w:type="dxa"/>
+              <w:end w:w="120" w:type="dxa"/>
+            </w:tcMar>
+          </w:tcPr>
+          <w:p>
+            <w:pPr>
+              <w:jc w:val="center"/>
+            </w:pPr>
+            <w:r>
+              <w:rPr>
+                <w:b/>
+                <w:color w:val="FFFFFF"/>
+                <w:sz w:val="18"/>
+              </w:rPr>
+              <w:t>Value</w:t>
+            </w:r>
+          </w:p>
+        </w:tc>
+        <w:tc>
+          <w:tcPr>
+            <w:tcW w:type="dxa" w:w="3888"/>
+            <w:shd w:fill="17365D"/>
+            <w:vAlign w:val="center"/>
+            <w:tcMar>
+              <w:top w:w="110" w:type="dxa"/>
+              <w:start w:w="120" w:type="dxa"/>
+              <w:bottom w:w="110" w:type="dxa"/>
+              <w:end w:w="120" w:type="dxa"/>
+            </w:tcMar>
+          </w:tcPr>
+          <w:p>
+            <w:pPr>
+              <w:jc w:val="center"/>
+            </w:pPr>
+            <w:r>
+              <w:rPr>
+                <w:b/>
+                <w:color w:val="FFFFFF"/>
+                <w:sz w:val="18"/>
+              </w:rPr>
+              <w:t>Why</w:t>
+            </w:r>
+          </w:p>
+        </w:tc>
+      </w:tr>
+      <w:tr>
+        <w:tc>
+          <w:tcPr>
+            <w:tcW w:type="dxa" w:w="1728"/>
+            <w:vAlign w:val="center"/>
+            <w:tcMar>
+              <w:top w:w="110" w:type="dxa"/>
+              <w:start w:w="120" w:type="dxa"/>
+              <w:bottom w:w="110" w:type="dxa"/>
+              <w:end w:w="120" w:type="dxa"/>
+            </w:tcMar>
+          </w:tcPr>
+          <w:p>
+            <w:pPr>
+              <w:spacing w:after="0"/>
+            </w:pPr>
+            <w:r>
+              <w:rPr>
+                <w:sz w:val="18"/>
+              </w:rPr>
+              <w:t>Runs</w:t>
+            </w:r>
+          </w:p>
+        </w:tc>
+        <w:tc>
+          <w:tcPr>
+            <w:tcW w:type="dxa" w:w="3240"/>
+            <w:vAlign w:val="center"/>
+            <w:tcMar>
+              <w:top w:w="110" w:type="dxa"/>
+              <w:start w:w="120" w:type="dxa"/>
+              <w:bottom w:w="110" w:type="dxa"/>
+              <w:end w:w="120" w:type="dxa"/>
+            </w:tcMar>
+          </w:tcPr>
+          <w:p>
+            <w:pPr>
+              <w:spacing w:after="0"/>
+            </w:pPr>
+            <w:r>
+              <w:rPr>
+                <w:sz w:val="18"/>
+              </w:rPr>
+              <w:t>2 (baseline and comparison)</w:t>
+            </w:r>
+          </w:p>
+        </w:tc>
+        <w:tc>
+          <w:tcPr>
+            <w:tcW w:type="dxa" w:w="3888"/>
+            <w:vAlign w:val="center"/>
+            <w:tcMar>
+              <w:top w:w="110" w:type="dxa"/>
+              <w:start w:w="120" w:type="dxa"/>
+              <w:bottom w:w="110" w:type="dxa"/>
+              <w:end w:w="120" w:type="dxa"/>
+            </w:tcMar>
+          </w:tcPr>
+          <w:p>
+            <w:pPr>
+              <w:spacing w:after="0"/>
+            </w:pPr>
+            <w:r>
+              <w:rPr>
+                <w:sz w:val="18"/>
+              </w:rPr>
+              <w:t>Two runs prove which values are dynamic.</w:t>
+            </w:r>
+          </w:p>
+        </w:tc>
+      </w:tr>
+      <w:tr>
+        <w:tc>
+          <w:tcPr>
+            <w:tcW w:type="dxa" w:w="1728"/>
+            <w:vAlign w:val="center"/>
+            <w:tcMar>
+              <w:top w:w="110" w:type="dxa"/>
+              <w:start w:w="120" w:type="dxa"/>
+              <w:bottom w:w="110" w:type="dxa"/>
+              <w:end w:w="120" w:type="dxa"/>
+            </w:tcMar>
+            <w:shd w:fill="F7F9FB"/>
+          </w:tcPr>
+          <w:p>
+            <w:pPr>
+              <w:spacing w:after="0"/>
+            </w:pPr>
+            <w:r>
+              <w:rPr>
+                <w:sz w:val="18"/>
+              </w:rPr>
+              <w:t>Time</w:t>
+            </w:r>
+          </w:p>
+        </w:tc>
+        <w:tc>
+          <w:tcPr>
+            <w:tcW w:type="dxa" w:w="3240"/>
+            <w:vAlign w:val="center"/>
+            <w:tcMar>
+              <w:top w:w="110" w:type="dxa"/>
+              <w:start w:w="120" w:type="dxa"/>
+              <w:bottom w:w="110" w:type="dxa"/>
+              <w:end w:w="120" w:type="dxa"/>
+            </w:tcMar>
+            <w:shd w:fill="F7F9FB"/>
+          </w:tcPr>
+          <w:p>
+            <w:pPr>
+              <w:spacing w:after="0"/>
+            </w:pPr>
+            <w:r>
+              <w:rPr>
+                <w:sz w:val="18"/>
+              </w:rPr>
+              <w:t>5 minutes per run</w:t>
+            </w:r>
+          </w:p>
+        </w:tc>
+        <w:tc>
+          <w:tcPr>
+            <w:tcW w:type="dxa" w:w="3888"/>
+            <w:vAlign w:val="center"/>
+            <w:tcMar>
+              <w:top w:w="110" w:type="dxa"/>
+              <w:start w:w="120" w:type="dxa"/>
+              <w:bottom w:w="110" w:type="dxa"/>
+              <w:end w:w="120" w:type="dxa"/>
+            </w:tcMar>
+            <w:shd w:fill="F7F9FB"/>
+          </w:tcPr>
+          <w:p>
+            <w:pPr>
+              <w:spacing w:after="0"/>
+            </w:pPr>
+            <w:r>
+              <w:rPr>
+                <w:sz w:val="18"/>
+              </w:rPr>
+              <w:t>Stops hanging endpoints and runaway scripts.</w:t>
+            </w:r>
+          </w:p>
+        </w:tc>
+      </w:tr>
+      <w:tr>
+        <w:tc>
+          <w:tcPr>
+            <w:tcW w:type="dxa" w:w="1728"/>
+            <w:vAlign w:val="center"/>
+            <w:tcMar>
+              <w:top w:w="110" w:type="dxa"/>
+              <w:start w:w="120" w:type="dxa"/>
+              <w:bottom w:w="110" w:type="dxa"/>
+              <w:end w:w="120" w:type="dxa"/>
+            </w:tcMar>
+          </w:tcPr>
+          <w:p>
+            <w:pPr>
+              <w:spacing w:after="0"/>
+            </w:pPr>
+            <w:r>
+              <w:rPr>
+                <w:sz w:val="18"/>
+              </w:rPr>
+              <w:t>Report size</w:t>
+            </w:r>
+          </w:p>
+        </w:tc>
+        <w:tc>
+          <w:tcPr>
+            <w:tcW w:type="dxa" w:w="3240"/>
+            <w:vAlign w:val="center"/>
+            <w:tcMar>
+              <w:top w:w="110" w:type="dxa"/>
+              <w:start w:w="120" w:type="dxa"/>
+              <w:bottom w:w="110" w:type="dxa"/>
+              <w:end w:w="120" w:type="dxa"/>
+            </w:tcMar>
+          </w:tcPr>
+          <w:p>
+            <w:pPr>
+              <w:spacing w:after="0"/>
+            </w:pPr>
+            <w:r>
+              <w:rPr>
+                <w:sz w:val="18"/>
+              </w:rPr>
+              <w:t>25 MiB per run</w:t>
+            </w:r>
+          </w:p>
+        </w:tc>
+        <w:tc>
+          <w:tcPr>
+            <w:tcW w:type="dxa" w:w="3888"/>
+            <w:vAlign w:val="center"/>
+            <w:tcMar>
+              <w:top w:w="110" w:type="dxa"/>
+              <w:start w:w="120" w:type="dxa"/>
+              <w:bottom w:w="110" w:type="dxa"/>
+              <w:end w:w="120" w:type="dxa"/>
+            </w:tcMar>
+          </w:tcPr>
+          <w:p>
+            <w:pPr>
+              <w:spacing w:after="0"/>
+            </w:pPr>
+            <w:r>
+              <w:rPr>
+                <w:sz w:val="18"/>
+              </w:rPr>
+              <w:t>Keeps analysis responsive; choose a folder for large collections.</w:t>
+            </w:r>
+          </w:p>
+        </w:tc>
+      </w:tr>
+      <w:tr>
+        <w:tc>
+          <w:tcPr>
+            <w:tcW w:type="dxa" w:w="1728"/>
+            <w:vAlign w:val="center"/>
+            <w:tcMar>
+              <w:top w:w="110" w:type="dxa"/>
+              <w:start w:w="120" w:type="dxa"/>
+              <w:bottom w:w="110" w:type="dxa"/>
+              <w:end w:w="120" w:type="dxa"/>
+            </w:tcMar>
+            <w:shd w:fill="F7F9FB"/>
+          </w:tcPr>
+          <w:p>
+            <w:pPr>
+              <w:spacing w:after="0"/>
+            </w:pPr>
+            <w:r>
+              <w:rPr>
+                <w:sz w:val="18"/>
+              </w:rPr>
+              <w:t>Destinations</w:t>
+            </w:r>
+          </w:p>
+        </w:tc>
+        <w:tc>
+          <w:tcPr>
+            <w:tcW w:type="dxa" w:w="3240"/>
+            <w:vAlign w:val="center"/>
+            <w:tcMar>
+              <w:top w:w="110" w:type="dxa"/>
+              <w:start w:w="120" w:type="dxa"/>
+              <w:bottom w:w="110" w:type="dxa"/>
+              <w:end w:w="120" w:type="dxa"/>
+            </w:tcMar>
+            <w:shd w:fill="F7F9FB"/>
+          </w:tcPr>
+          <w:p>
+            <w:pPr>
+              <w:spacing w:after="0"/>
+            </w:pPr>
+            <w:r>
+              <w:rPr>
+                <w:sz w:val="18"/>
+              </w:rPr>
+              <w:t>Public HTTPS only; redirects not followed</w:t>
+            </w:r>
+          </w:p>
+        </w:tc>
+        <w:tc>
+          <w:tcPr>
+            <w:tcW w:type="dxa" w:w="3888"/>
+            <w:vAlign w:val="center"/>
+            <w:tcMar>
+              <w:top w:w="110" w:type="dxa"/>
+              <w:start w:w="120" w:type="dxa"/>
+              <w:bottom w:w="110" w:type="dxa"/>
+              <w:end w:w="120" w:type="dxa"/>
+            </w:tcMar>
+            <w:shd w:fill="F7F9FB"/>
+          </w:tcPr>
+          <w:p>
+            <w:pPr>
+              <w:spacing w:after="0"/>
+            </w:pPr>
+            <w:r>
+              <w:rPr>
+                <w:sz w:val="18"/>
+              </w:rPr>
+              <w:t>Blocks localhost, private networks and cloud metadata addresses.</w:t>
+            </w:r>
+          </w:p>
+        </w:tc>
+      </w:tr>
+      <w:tr>
+        <w:tc>
+          <w:tcPr>
+            <w:tcW w:type="dxa" w:w="1728"/>
+            <w:vAlign w:val="center"/>
+            <w:tcMar>
+              <w:top w:w="110" w:type="dxa"/>
+              <w:start w:w="120" w:type="dxa"/>
+              <w:bottom w:w="110" w:type="dxa"/>
+              <w:end w:w="120" w:type="dxa"/>
+            </w:tcMar>
+          </w:tcPr>
+          <w:p>
+            <w:pPr>
+              <w:spacing w:after="0"/>
+            </w:pPr>
+            <w:r>
+              <w:rPr>
+                <w:sz w:val="18"/>
+              </w:rPr>
+              <w:t>Isolation</w:t>
+            </w:r>
+          </w:p>
+        </w:tc>
+        <w:tc>
+          <w:tcPr>
+            <w:tcW w:type="dxa" w:w="3240"/>
+            <w:vAlign w:val="center"/>
+            <w:tcMar>
+              <w:top w:w="110" w:type="dxa"/>
+              <w:start w:w="120" w:type="dxa"/>
+              <w:bottom w:w="110" w:type="dxa"/>
+              <w:end w:w="120" w:type="dxa"/>
+            </w:tcMar>
+          </w:tcPr>
+          <w:p>
+            <w:pPr>
+              <w:spacing w:after="0"/>
+            </w:pPr>
+            <w:r>
+              <w:rPr>
+                <w:sz w:val="18"/>
+              </w:rPr>
+              <w:t>Fresh container per run, no host files or credentials</w:t>
+            </w:r>
+          </w:p>
+        </w:tc>
+        <w:tc>
+          <w:tcPr>
+            <w:tcW w:type="dxa" w:w="3888"/>
+            <w:vAlign w:val="center"/>
+            <w:tcMar>
+              <w:top w:w="110" w:type="dxa"/>
+              <w:start w:w="120" w:type="dxa"/>
+              <w:bottom w:w="110" w:type="dxa"/>
+              <w:end w:w="120" w:type="dxa"/>
+            </w:tcMar>
+          </w:tcPr>
+          <w:p>
+            <w:pPr>
+              <w:spacing w:after="0"/>
+            </w:pPr>
+            <w:r>
+              <w:rPr>
+                <w:sz w:val="18"/>
+              </w:rPr>
+              <w:t>Collection scripts are untrusted code.</w:t>
+            </w:r>
+          </w:p>
+        </w:tc>
+      </w:tr>
+    </w:tbl>
+    <w:p>
+      <w:pPr>
+        <w:spacing w:after="0"/>
+      </w:pPr>
+    </w:p>
+    <w:p>
+      <w:pPr>
+        <w:pStyle w:val="Heading2"/>
+      </w:pPr>
+      <w:r>
+        <w:t>Step 4  Execution progress</w:t>
+      </w:r>
+    </w:p>
+    <w:p>
+      <w:r>
+        <w:t>The progress view shows each stage: waiting for a runner, checking destinations, Run A, Run B, and analysis. A run can be cancelled at any time.</w:t>
+      </w:r>
+    </w:p>
+    <w:p>
+      <w:pPr>
+        <w:jc w:val="center"/>
+      </w:pPr>
+      <w:r>
+        <w:drawing>
+          <wp:inline xmlns:a="http://schemas.openxmlformats.org/drawingml/2006/main" xmlns:pic="http://schemas.openxmlformats.org/drawingml/2006/picture">
+            <wp:extent cx="5120640" cy="1804226"/>
+            <wp:docPr id="4" name="Picture 4" descr="Execution progress with runner and destination checks complete and Run A executing"/>
+            <wp:cNvGraphicFramePr>
+              <a:graphicFrameLocks noChangeAspect="1"/>
+            </wp:cNvGraphicFramePr>
+            <a:graphic>
+              <a:graphicData uri="http://schemas.openxmlformats.org/drawingml/2006/picture">
+                <pic:pic>
+                  <pic:nvPicPr>
+                    <pic:cNvPr id="0" name="image.png"/>
+                    <pic:cNvPicPr/>
+                  </pic:nvPicPr>
+                  <pic:blipFill>
+                    <a:blip r:embed="rId13"/>
+                    <a:stretch>
+                      <a:fillRect/>
+                    </a:stretch>
+                  </pic:blipFill>
+                  <pic:spPr>
+                    <a:xfrm>
+                      <a:off x="0" y="0"/>
+                      <a:ext cx="5120640" cy="1804226"/>
+                    </a:xfrm>
+                    <a:prstGeom prst="rect"/>
+                  </pic:spPr>
+                </pic:pic>
+              </a:graphicData>
+            </a:graphic>
+          </wp:inline>
+        </w:drawing>
+      </w:r>
+    </w:p>
+    <w:p>
+      <w:pPr>
+        <w:spacing w:before="60" w:after="180"/>
+        <w:jc w:val="center"/>
+      </w:pPr>
+      <w:r>
+        <w:rPr>
+          <w:i/>
+          <w:color w:val="555555"/>
+          <w:sz w:val="17"/>
+        </w:rPr>
+        <w:t>Figure 4  Two isolated Newman runs, then the standard analysis</w:t>
+      </w:r>
+    </w:p>
+    <w:p>
+      <w:pPr>
+        <w:pStyle w:val="Heading2"/>
+      </w:pPr>
+      <w:r>
+        <w:t>Step 5  Analysis results</w:t>
+      </w:r>
+    </w:p>
+    <w:p>
+      <w:r>
+        <w:t>When both runs finish, Baseline11 opens the same analysis screens used for uploaded reports, starting with Run Health. Continue with section 5 to review and accept correlations.</w:t>
+      </w:r>
+    </w:p>
+    <w:p>
+      <w:pPr>
+        <w:jc w:val="center"/>
+      </w:pPr>
+      <w:r>
+        <w:drawing>
+          <wp:inline xmlns:a="http://schemas.openxmlformats.org/drawingml/2006/main" xmlns:pic="http://schemas.openxmlformats.org/drawingml/2006/picture">
+            <wp:extent cx="5669280" cy="3397139"/>
+            <wp:docPr id="5" name="Picture 5" descr="Run Health for the executed collection showing readiness ready, one correlation and two healthy runs"/>
+            <wp:cNvGraphicFramePr>
+              <a:graphicFrameLocks noChangeAspect="1"/>
+            </wp:cNvGraphicFramePr>
+            <a:graphic>
+              <a:graphicData uri="http://schemas.openxmlformats.org/drawingml/2006/picture">
+                <pic:pic>
+                  <pic:nvPicPr>
+                    <pic:cNvPr id="0" name="image.png"/>
+                    <pic:cNvPicPr/>
+                  </pic:nvPicPr>
+                  <pic:blipFill>
+                    <a:blip r:embed="rId14"/>
+                    <a:stretch>
+                      <a:fillRect/>
+                    </a:stretch>
+                  </pic:blipFill>
+                  <pic:spPr>
+                    <a:xfrm>
+                      <a:off x="0" y="0"/>
+                      <a:ext cx="5669280" cy="3397139"/>
+                    </a:xfrm>
+                    <a:prstGeom prst="rect"/>
+                  </pic:spPr>
+                </pic:pic>
+              </a:graphicData>
+            </a:graphic>
+          </wp:inline>
+        </w:drawing>
+      </w:r>
+    </w:p>
+    <w:p>
+      <w:pPr>
+        <w:spacing w:before="60" w:after="180"/>
+        <w:jc w:val="center"/>
+      </w:pPr>
+      <w:r>
+        <w:rPr>
+          <w:i/>
+          <w:color w:val="555555"/>
+          <w:sz w:val="17"/>
+        </w:rPr>
+        <w:t>Figure 5  The executed collection opens directly in Run Health</w:t>
+      </w:r>
+    </w:p>
+    <w:p>
+      <w:pPr>
+        <w:pStyle w:val="Heading2"/>
+      </w:pPr>
+      <w:r>
+        <w:t>When a run does not complete</w:t>
+      </w:r>
+    </w:p>
+    <w:p>
+      <w:r>
+        <w:t>Failures are shown in the progress view with the reason, the affected request and what to do next. Retry reuses the same inputs; Start over returns to the files step.</w:t>
+      </w:r>
+    </w:p>
+    <w:p>
+      <w:pPr>
+        <w:jc w:val="center"/>
+      </w:pPr>
+      <w:r>
+        <w:drawing>
+          <wp:inline xmlns:a="http://schemas.openxmlformats.org/drawingml/2006/main" xmlns:pic="http://schemas.openxmlformats.org/drawingml/2006/picture">
+            <wp:extent cx="5120640" cy="2812352"/>
+            <wp:docPr id="6" name="Picture 6" descr="Failure panel stating that request Internal admin targets a private IP and was blocked by destination validation"/>
+            <wp:cNvGraphicFramePr>
+              <a:graphicFrameLocks noChangeAspect="1"/>
+            </wp:cNvGraphicFramePr>
+            <a:graphic>
+              <a:graphicData uri="http://schemas.openxmlformats.org/drawingml/2006/picture">
+                <pic:pic>
+                  <pic:nvPicPr>
+                    <pic:cNvPr id="0" name="image.png"/>
+                    <pic:cNvPicPr/>
+                  </pic:nvPicPr>
+                  <pic:blipFill>
+                    <a:blip r:embed="rId15"/>
+                    <a:stretch>
+                      <a:fillRect/>
+                    </a:stretch>
+                  </pic:blipFill>
+                  <pic:spPr>
+                    <a:xfrm>
+                      <a:off x="0" y="0"/>
+                      <a:ext cx="5120640" cy="2812352"/>
+                    </a:xfrm>
+                    <a:prstGeom prst="rect"/>
+                  </pic:spPr>
+                </pic:pic>
+              </a:graphicData>
+            </a:graphic>
+          </wp:inline>
+        </w:drawing>
+      </w:r>
+    </w:p>
+    <w:p>
+      <w:pPr>
+        <w:spacing w:before="60" w:after="180"/>
+        <w:jc w:val="center"/>
+      </w:pPr>
+      <w:r>
+        <w:rPr>
+          <w:i/>
+          <w:color w:val="555555"/>
+          <w:sz w:val="17"/>
+        </w:rPr>
+        <w:t>Figure 6  A blocked private destination, with guidance</w:t>
+      </w:r>
+    </w:p>
+    <w:tbl>
+      <w:tblPr>
+        <w:tblW w:type="auto" w:w="0"/>
+        <w:jc w:val="center"/>
+        <w:tblLayout w:type="fixed"/>
+        <w:tblLook w:firstColumn="1" w:firstRow="1" w:lastColumn="0" w:lastRow="0" w:noHBand="0" w:noVBand="1" w:val="04A0"/>
+        <w:tblBorders>
+          <w:top w:val="single" w:sz="6" w:color="D9D9D9"/>
+          <w:left w:val="single" w:sz="6" w:color="D9D9D9"/>
+          <w:bottom w:val="single" w:sz="6" w:color="D9D9D9"/>
+          <w:right w:val="single" w:sz="6" w:color="D9D9D9"/>
+          <w:insideH w:val="single" w:sz="6" w:color="D9D9D9"/>
+          <w:insideV w:val="single" w:sz="6" w:color="D9D9D9"/>
+        </w:tblBorders>
+      </w:tblPr>
+      <w:tblGrid>
+        <w:gridCol w:w="3360"/>
+        <w:gridCol w:w="3360"/>
+        <w:gridCol w:w="3360"/>
+      </w:tblGrid>
+      <w:tr>
+        <w:trPr>
+          <w:tblHeader w:val="true"/>
+        </w:trPr>
+        <w:tc>
+          <w:tcPr>
+            <w:tcW w:type="dxa" w:w="2664"/>
+            <w:shd w:fill="17365D"/>
+            <w:vAlign w:val="center"/>
+            <w:tcMar>
+              <w:top w:w="110" w:type="dxa"/>
+              <w:start w:w="120" w:type="dxa"/>
+              <w:bottom w:w="110" w:type="dxa"/>
+              <w:end w:w="120" w:type="dxa"/>
+            </w:tcMar>
+          </w:tcPr>
+          <w:p>
+            <w:pPr>
+              <w:jc w:val="center"/>
+            </w:pPr>
+            <w:r>
+              <w:rPr>
+                <w:b/>
+                <w:color w:val="FFFFFF"/>
+                <w:sz w:val="18"/>
+              </w:rPr>
+              <w:t>Code</w:t>
+            </w:r>
+          </w:p>
+        </w:tc>
+        <w:tc>
+          <w:tcPr>
+            <w:tcW w:type="dxa" w:w="3168"/>
+            <w:shd w:fill="17365D"/>
+            <w:vAlign w:val="center"/>
+            <w:tcMar>
+              <w:top w:w="110" w:type="dxa"/>
+              <w:start w:w="120" w:type="dxa"/>
+              <w:bottom w:w="110" w:type="dxa"/>
+              <w:end w:w="120" w:type="dxa"/>
+            </w:tcMar>
+          </w:tcPr>
+          <w:p>
+            <w:pPr>
+              <w:jc w:val="center"/>
+            </w:pPr>
+            <w:r>
+              <w:rPr>
+                <w:b/>
+                <w:color w:val="FFFFFF"/>
+                <w:sz w:val="18"/>
+              </w:rPr>
+              <w:t>Meaning</w:t>
+            </w:r>
+          </w:p>
+        </w:tc>
+        <w:tc>
+          <w:tcPr>
+            <w:tcW w:type="dxa" w:w="3024"/>
+            <w:shd w:fill="17365D"/>
+            <w:vAlign w:val="center"/>
+            <w:tcMar>
+              <w:top w:w="110" w:type="dxa"/>
+              <w:start w:w="120" w:type="dxa"/>
+              <w:bottom w:w="110" w:type="dxa"/>
+              <w:end w:w="120" w:type="dxa"/>
+            </w:tcMar>
+          </w:tcPr>
+          <w:p>
+            <w:pPr>
+              <w:jc w:val="center"/>
+            </w:pPr>
+            <w:r>
+              <w:rPr>
+                <w:b/>
+                <w:color w:val="FFFFFF"/>
+                <w:sz w:val="18"/>
+              </w:rPr>
+              <w:t>Tester action</w:t>
+            </w:r>
+          </w:p>
+        </w:tc>
+      </w:tr>
+      <w:tr>
+        <w:tc>
+          <w:tcPr>
+            <w:tcW w:type="dxa" w:w="2664"/>
+            <w:vAlign w:val="center"/>
+            <w:tcMar>
+              <w:top w:w="110" w:type="dxa"/>
+              <w:start w:w="120" w:type="dxa"/>
+              <w:bottom w:w="110" w:type="dxa"/>
+              <w:end w:w="120" w:type="dxa"/>
+            </w:tcMar>
+          </w:tcPr>
+          <w:p>
+            <w:pPr>
+              <w:spacing w:after="0"/>
+            </w:pPr>
+            <w:r>
+              <w:rPr>
+                <w:sz w:val="18"/>
+              </w:rPr>
+              <w:t>destination_validation_failed</w:t>
+            </w:r>
+          </w:p>
+        </w:tc>
+        <w:tc>
+          <w:tcPr>
+            <w:tcW w:type="dxa" w:w="3168"/>
+            <w:vAlign w:val="center"/>
+            <w:tcMar>
+              <w:top w:w="110" w:type="dxa"/>
+              <w:start w:w="120" w:type="dxa"/>
+              <w:bottom w:w="110" w:type="dxa"/>
+              <w:end w:w="120" w:type="dxa"/>
+            </w:tcMar>
+          </w:tcPr>
+          <w:p>
+            <w:pPr>
+              <w:spacing w:after="0"/>
+            </w:pPr>
+            <w:r>
+              <w:rPr>
+                <w:sz w:val="18"/>
+              </w:rPr>
+              <w:t>A request targets localhost, a private or metadata IP, or plain HTTP.</w:t>
+            </w:r>
+          </w:p>
+        </w:tc>
+        <w:tc>
+          <w:tcPr>
+            <w:tcW w:type="dxa" w:w="3024"/>
+            <w:vAlign w:val="center"/>
+            <w:tcMar>
+              <w:top w:w="110" w:type="dxa"/>
+              <w:start w:w="120" w:type="dxa"/>
+              <w:bottom w:w="110" w:type="dxa"/>
+              <w:end w:w="120" w:type="dxa"/>
+            </w:tcMar>
+          </w:tcPr>
+          <w:p>
+            <w:pPr>
+              <w:spacing w:after="0"/>
+            </w:pPr>
+            <w:r>
+              <w:rPr>
+                <w:sz w:val="18"/>
+              </w:rPr>
+              <w:t>Point host variables at a public HTTPS address, or use advanced mode from inside the network.</w:t>
+            </w:r>
+          </w:p>
+        </w:tc>
+      </w:tr>
+      <w:tr>
+        <w:tc>
+          <w:tcPr>
+            <w:tcW w:type="dxa" w:w="2664"/>
+            <w:vAlign w:val="center"/>
+            <w:tcMar>
+              <w:top w:w="110" w:type="dxa"/>
+              <w:start w:w="120" w:type="dxa"/>
+              <w:bottom w:w="110" w:type="dxa"/>
+              <w:end w:w="120" w:type="dxa"/>
+            </w:tcMar>
+            <w:shd w:fill="F7F9FB"/>
+          </w:tcPr>
+          <w:p>
+            <w:pPr>
+              <w:spacing w:after="0"/>
+            </w:pPr>
+            <w:r>
+              <w:rPr>
+                <w:sz w:val="18"/>
+              </w:rPr>
+              <w:t>timeout</w:t>
+            </w:r>
+          </w:p>
+        </w:tc>
+        <w:tc>
+          <w:tcPr>
+            <w:tcW w:type="dxa" w:w="3168"/>
+            <w:vAlign w:val="center"/>
+            <w:tcMar>
+              <w:top w:w="110" w:type="dxa"/>
+              <w:start w:w="120" w:type="dxa"/>
+              <w:bottom w:w="110" w:type="dxa"/>
+              <w:end w:w="120" w:type="dxa"/>
+            </w:tcMar>
+            <w:shd w:fill="F7F9FB"/>
+          </w:tcPr>
+          <w:p>
+            <w:pPr>
+              <w:spacing w:after="0"/>
+            </w:pPr>
+            <w:r>
+              <w:rPr>
+                <w:sz w:val="18"/>
+              </w:rPr>
+              <w:t>A run exceeded 5 minutes.</w:t>
+            </w:r>
+          </w:p>
+        </w:tc>
+        <w:tc>
+          <w:tcPr>
+            <w:tcW w:type="dxa" w:w="3024"/>
+            <w:vAlign w:val="center"/>
+            <w:tcMar>
+              <w:top w:w="110" w:type="dxa"/>
+              <w:start w:w="120" w:type="dxa"/>
+              <w:bottom w:w="110" w:type="dxa"/>
+              <w:end w:w="120" w:type="dxa"/>
+            </w:tcMar>
+            <w:shd w:fill="F7F9FB"/>
+          </w:tcPr>
+          <w:p>
+            <w:pPr>
+              <w:spacing w:after="0"/>
+            </w:pPr>
+            <w:r>
+              <w:rPr>
+                <w:sz w:val="18"/>
+              </w:rPr>
+              <w:t>Choose a smaller folder or check for a hanging endpoint.</w:t>
+            </w:r>
+          </w:p>
+        </w:tc>
+      </w:tr>
+      <w:tr>
+        <w:tc>
+          <w:tcPr>
+            <w:tcW w:type="dxa" w:w="2664"/>
+            <w:vAlign w:val="center"/>
+            <w:tcMar>
+              <w:top w:w="110" w:type="dxa"/>
+              <w:start w:w="120" w:type="dxa"/>
+              <w:bottom w:w="110" w:type="dxa"/>
+              <w:end w:w="120" w:type="dxa"/>
+            </w:tcMar>
+          </w:tcPr>
+          <w:p>
+            <w:pPr>
+              <w:spacing w:after="0"/>
+            </w:pPr>
+            <w:r>
+              <w:rPr>
+                <w:sz w:val="18"/>
+              </w:rPr>
+              <w:t>report_too_large</w:t>
+            </w:r>
+          </w:p>
+        </w:tc>
+        <w:tc>
+          <w:tcPr>
+            <w:tcW w:type="dxa" w:w="3168"/>
+            <w:vAlign w:val="center"/>
+            <w:tcMar>
+              <w:top w:w="110" w:type="dxa"/>
+              <w:start w:w="120" w:type="dxa"/>
+              <w:bottom w:w="110" w:type="dxa"/>
+              <w:end w:w="120" w:type="dxa"/>
+            </w:tcMar>
+          </w:tcPr>
+          <w:p>
+            <w:pPr>
+              <w:spacing w:after="0"/>
+            </w:pPr>
+            <w:r>
+              <w:rPr>
+                <w:sz w:val="18"/>
+              </w:rPr>
+              <w:t>A run produced a report over 25 MiB.</w:t>
+            </w:r>
+          </w:p>
+        </w:tc>
+        <w:tc>
+          <w:tcPr>
+            <w:tcW w:type="dxa" w:w="3024"/>
+            <w:vAlign w:val="center"/>
+            <w:tcMar>
+              <w:top w:w="110" w:type="dxa"/>
+              <w:start w:w="120" w:type="dxa"/>
+              <w:bottom w:w="110" w:type="dxa"/>
+              <w:end w:w="120" w:type="dxa"/>
+            </w:tcMar>
+          </w:tcPr>
+          <w:p>
+            <w:pPr>
+              <w:spacing w:after="0"/>
+            </w:pPr>
+            <w:r>
+              <w:rPr>
+                <w:sz w:val="18"/>
+              </w:rPr>
+              <w:t>Choose a smaller folder.</w:t>
+            </w:r>
+          </w:p>
+        </w:tc>
+      </w:tr>
+      <w:tr>
+        <w:tc>
+          <w:tcPr>
+            <w:tcW w:type="dxa" w:w="2664"/>
+            <w:vAlign w:val="center"/>
+            <w:tcMar>
+              <w:top w:w="110" w:type="dxa"/>
+              <w:start w:w="120" w:type="dxa"/>
+              <w:bottom w:w="110" w:type="dxa"/>
+              <w:end w:w="120" w:type="dxa"/>
+            </w:tcMar>
+            <w:shd w:fill="F7F9FB"/>
+          </w:tcPr>
+          <w:p>
+            <w:pPr>
+              <w:spacing w:after="0"/>
+            </w:pPr>
+            <w:r>
+              <w:rPr>
+                <w:sz w:val="18"/>
+              </w:rPr>
+              <w:t>resource_limit</w:t>
+            </w:r>
+          </w:p>
+        </w:tc>
+        <w:tc>
+          <w:tcPr>
+            <w:tcW w:type="dxa" w:w="3168"/>
+            <w:vAlign w:val="center"/>
+            <w:tcMar>
+              <w:top w:w="110" w:type="dxa"/>
+              <w:start w:w="120" w:type="dxa"/>
+              <w:bottom w:w="110" w:type="dxa"/>
+              <w:end w:w="120" w:type="dxa"/>
+            </w:tcMar>
+            <w:shd w:fill="F7F9FB"/>
+          </w:tcPr>
+          <w:p>
+            <w:pPr>
+              <w:spacing w:after="0"/>
+            </w:pPr>
+            <w:r>
+              <w:rPr>
+                <w:sz w:val="18"/>
+              </w:rPr>
+              <w:t>A run used too much memory or too many processes.</w:t>
+            </w:r>
+          </w:p>
+        </w:tc>
+        <w:tc>
+          <w:tcPr>
+            <w:tcW w:type="dxa" w:w="3024"/>
+            <w:vAlign w:val="center"/>
+            <w:tcMar>
+              <w:top w:w="110" w:type="dxa"/>
+              <w:start w:w="120" w:type="dxa"/>
+              <w:bottom w:w="110" w:type="dxa"/>
+              <w:end w:w="120" w:type="dxa"/>
+            </w:tcMar>
+            <w:shd w:fill="F7F9FB"/>
+          </w:tcPr>
+          <w:p>
+            <w:pPr>
+              <w:spacing w:after="0"/>
+            </w:pPr>
+            <w:r>
+              <w:rPr>
+                <w:sz w:val="18"/>
+              </w:rPr>
+              <w:t>Try a smaller folder or simplify heavy scripts.</w:t>
+            </w:r>
+          </w:p>
+        </w:tc>
+      </w:tr>
+      <w:tr>
+        <w:tc>
+          <w:tcPr>
+            <w:tcW w:type="dxa" w:w="2664"/>
+            <w:vAlign w:val="center"/>
+            <w:tcMar>
+              <w:top w:w="110" w:type="dxa"/>
+              <w:start w:w="120" w:type="dxa"/>
+              <w:bottom w:w="110" w:type="dxa"/>
+              <w:end w:w="120" w:type="dxa"/>
+            </w:tcMar>
+          </w:tcPr>
+          <w:p>
+            <w:pPr>
+              <w:spacing w:after="0"/>
+            </w:pPr>
+            <w:r>
+              <w:rPr>
+                <w:sz w:val="18"/>
+              </w:rPr>
+              <w:t>runner_unavailable</w:t>
+            </w:r>
+          </w:p>
+        </w:tc>
+        <w:tc>
+          <w:tcPr>
+            <w:tcW w:type="dxa" w:w="3168"/>
+            <w:vAlign w:val="center"/>
+            <w:tcMar>
+              <w:top w:w="110" w:type="dxa"/>
+              <w:start w:w="120" w:type="dxa"/>
+              <w:bottom w:w="110" w:type="dxa"/>
+              <w:end w:w="120" w:type="dxa"/>
+            </w:tcMar>
+          </w:tcPr>
+          <w:p>
+            <w:pPr>
+              <w:spacing w:after="0"/>
+            </w:pPr>
+            <w:r>
+              <w:rPr>
+                <w:sz w:val="18"/>
+              </w:rPr>
+              <w:t>The Newman runner is not available.</w:t>
+            </w:r>
+          </w:p>
+        </w:tc>
+        <w:tc>
+          <w:tcPr>
+            <w:tcW w:type="dxa" w:w="3024"/>
+            <w:vAlign w:val="center"/>
+            <w:tcMar>
+              <w:top w:w="110" w:type="dxa"/>
+              <w:start w:w="120" w:type="dxa"/>
+              <w:bottom w:w="110" w:type="dxa"/>
+              <w:end w:w="120" w:type="dxa"/>
+            </w:tcMar>
+          </w:tcPr>
+          <w:p>
+            <w:pPr>
+              <w:spacing w:after="0"/>
+            </w:pPr>
+            <w:r>
+              <w:rPr>
+                <w:sz w:val="18"/>
+              </w:rPr>
+              <w:t>Ask the administrator to check the runner service, then retry.</w:t>
+            </w:r>
+          </w:p>
+        </w:tc>
+      </w:tr>
+      <w:tr>
+        <w:tc>
+          <w:tcPr>
+            <w:tcW w:type="dxa" w:w="2664"/>
+            <w:vAlign w:val="center"/>
+            <w:tcMar>
+              <w:top w:w="110" w:type="dxa"/>
+              <w:start w:w="120" w:type="dxa"/>
+              <w:bottom w:w="110" w:type="dxa"/>
+              <w:end w:w="120" w:type="dxa"/>
+            </w:tcMar>
+            <w:shd w:fill="F7F9FB"/>
+          </w:tcPr>
+          <w:p>
+            <w:pPr>
+              <w:spacing w:after="0"/>
+            </w:pPr>
+            <w:r>
+              <w:rPr>
+                <w:sz w:val="18"/>
+              </w:rPr>
+              <w:t>analysis_error</w:t>
+            </w:r>
+          </w:p>
+        </w:tc>
+        <w:tc>
+          <w:tcPr>
+            <w:tcW w:type="dxa" w:w="3168"/>
+            <w:vAlign w:val="center"/>
+            <w:tcMar>
+              <w:top w:w="110" w:type="dxa"/>
+              <w:start w:w="120" w:type="dxa"/>
+              <w:bottom w:w="110" w:type="dxa"/>
+              <w:end w:w="120" w:type="dxa"/>
+            </w:tcMar>
+            <w:shd w:fill="F7F9FB"/>
+          </w:tcPr>
+          <w:p>
+            <w:pPr>
+              <w:spacing w:after="0"/>
+            </w:pPr>
+            <w:r>
+              <w:rPr>
+                <w:sz w:val="18"/>
+              </w:rPr>
+              <w:t>Both runs finished but could not be analysed.</w:t>
+            </w:r>
+          </w:p>
+        </w:tc>
+        <w:tc>
+          <w:tcPr>
+            <w:tcW w:type="dxa" w:w="3024"/>
+            <w:vAlign w:val="center"/>
+            <w:tcMar>
+              <w:top w:w="110" w:type="dxa"/>
+              <w:start w:w="120" w:type="dxa"/>
+              <w:bottom w:w="110" w:type="dxa"/>
+              <w:end w:w="120" w:type="dxa"/>
+            </w:tcMar>
+            <w:shd w:fill="F7F9FB"/>
+          </w:tcPr>
+          <w:p>
+            <w:pPr>
+              <w:spacing w:after="0"/>
+            </w:pPr>
+            <w:r>
+              <w:rPr>
+                <w:sz w:val="18"/>
+              </w:rPr>
+              <w:t>Check that both runs succeed (mostly 2xx) and retry.</w:t>
+            </w:r>
+          </w:p>
+        </w:tc>
+      </w:tr>
+    </w:tbl>
+    <w:p>
+      <w:pPr>
+        <w:spacing w:after="0"/>
+      </w:pPr>
     </w:p>
     <w:p>
       <w:pPr>
         <w:pStyle w:val="Heading1"/>
       </w:pPr>
       <w:r>
-        <w:t>1 Prepare the Postman Collection</w:t>
+        <w:t>2 Prepare the Postman Collection</w:t>
       </w:r>
     </w:p>
     <w:p>
@@ -1370,16 +2795,11 @@
       </w:r>
     </w:p>
     <w:p>
-      <w:r>
-        <w:br w:type="page"/>
-      </w:r>
-    </w:p>
-    <w:p>
       <w:pPr>
         <w:pStyle w:val="Heading1"/>
       </w:pPr>
       <w:r>
-        <w:t>2 Generate Newman Reports</w:t>
+        <w:t>3 Generate Newman Reports (Advanced Mode)</w:t>
       </w:r>
     </w:p>
     <w:p>
@@ -1993,21 +3413,16 @@
       </w:r>
     </w:p>
     <w:p>
-      <w:r>
-        <w:br w:type="page"/>
-      </w:r>
-    </w:p>
-    <w:p>
       <w:pPr>
         <w:pStyle w:val="Heading1"/>
       </w:pPr>
       <w:r>
-        <w:t>3 Upload and Review the Analysis</w:t>
+        <w:t>4 Upload and Review the Analysis</w:t>
       </w:r>
     </w:p>
     <w:p>
       <w:r>
-        <w:t>Open Baseline11 and upload baseline.json first and comparison.json second. Do not upload the Postman collection, environment, HTML report or a JMX into the report uploader.</w:t>
+        <w:t>In the recommended mode Baseline11 opens this analysis automatically when both runs finish. In advanced mode, choose Upload existing Newman reports and upload baseline.json first and comparison.json second. Do not upload the Postman collection, environment, HTML report or a JMX into the report uploader.</w:t>
       </w:r>
     </w:p>
     <w:p>
@@ -2031,7 +3446,7 @@
         <w:drawing>
           <wp:inline xmlns:a="http://schemas.openxmlformats.org/drawingml/2006/main" xmlns:pic="http://schemas.openxmlformats.org/drawingml/2006/picture">
             <wp:extent cx="5897880" cy="3820612"/>
-            <wp:docPr id="1" name="Picture 1" descr="Baseline11 Run Health showing seven aligned successful requests and one reviewable empty dataset warning"/>
+            <wp:docPr id="7" name="Picture 7" descr="Baseline11 Run Health showing seven aligned successful requests and one reviewable empty dataset warning"/>
             <wp:cNvGraphicFramePr>
               <a:graphicFrameLocks noChangeAspect="1"/>
             </wp:cNvGraphicFramePr>
@@ -2039,11 +3454,11 @@
               <a:graphicData uri="http://schemas.openxmlformats.org/drawingml/2006/picture">
                 <pic:pic>
                   <pic:nvPicPr>
-                    <pic:cNvPr id="0" name="codex-clipboard-89d30d80-0bc6-46e5-85fe-1e4669c390cc.png"/>
+                    <pic:cNvPr id="0" name="run-health.png"/>
                     <pic:cNvPicPr/>
                   </pic:nvPicPr>
                   <pic:blipFill>
-                    <a:blip r:embed="rId10"/>
+                    <a:blip r:embed="rId16"/>
                     <a:stretch>
                       <a:fillRect/>
                     </a:stretch>
@@ -2073,7 +3488,7 @@
           <w:color w:val="555555"/>
           <w:sz w:val="17"/>
         </w:rPr>
-        <w:t>Figure 1  Example Run Health with seven aligned HTTP 200 requests</w:t>
+        <w:t>Figure 7  Example Run Health with seven aligned HTTP 200 requests</w:t>
       </w:r>
     </w:p>
     <w:p>
@@ -2484,16 +3899,11 @@
       </w:pPr>
     </w:p>
     <w:p>
-      <w:r>
-        <w:br w:type="page"/>
-      </w:r>
-    </w:p>
-    <w:p>
       <w:pPr>
         <w:pStyle w:val="Heading1"/>
       </w:pPr>
       <w:r>
-        <w:t>4 Review and Accept Correlation</w:t>
+        <w:t>5 Review and Accept Correlation</w:t>
       </w:r>
     </w:p>
     <w:p>
@@ -2509,7 +3919,7 @@
         <w:drawing>
           <wp:inline xmlns:a="http://schemas.openxmlformats.org/drawingml/2006/main" xmlns:pic="http://schemas.openxmlformats.org/drawingml/2006/picture">
             <wp:extent cx="5897880" cy="2693076"/>
-            <wp:docPr id="2" name="Picture 2" descr="Baseline11 Candidates page showing one high confidence ID value produced at JSONPath id and reused by three requests"/>
+            <wp:docPr id="8" name="Picture 8" descr="Baseline11 Candidates page showing one high confidence ID value produced at JSONPath id and reused by three requests"/>
             <wp:cNvGraphicFramePr>
               <a:graphicFrameLocks noChangeAspect="1"/>
             </wp:cNvGraphicFramePr>
@@ -2517,11 +3927,11 @@
               <a:graphicData uri="http://schemas.openxmlformats.org/drawingml/2006/picture">
                 <pic:pic>
                   <pic:nvPicPr>
-                    <pic:cNvPr id="0" name="codex-clipboard-88533f9a-e708-490d-94fd-9deb54fab61d.png"/>
+                    <pic:cNvPr id="0" name="candidates.png"/>
                     <pic:cNvPicPr/>
                   </pic:nvPicPr>
                   <pic:blipFill>
-                    <a:blip r:embed="rId11"/>
+                    <a:blip r:embed="rId17"/>
                     <a:stretch>
                       <a:fillRect/>
                     </a:stretch>
@@ -2551,7 +3961,7 @@
           <w:color w:val="555555"/>
           <w:sz w:val="17"/>
         </w:rPr>
-        <w:t>Figure 2  One high-confidence ID candidate produced at JSONPath $.id and reused by three requests</w:t>
+        <w:t>Figure 8  One high-confidence ID candidate produced at JSONPath $.id and reused by three requests</w:t>
       </w:r>
     </w:p>
     <w:p>
@@ -2938,16 +4348,11 @@
       </w:r>
     </w:p>
     <w:p>
-      <w:r>
-        <w:br w:type="page"/>
-      </w:r>
-    </w:p>
-    <w:p>
       <w:pPr>
         <w:pStyle w:val="Heading1"/>
       </w:pPr>
       <w:r>
-        <w:t>5 Generate the JMeter Plan</w:t>
+        <w:t>6 Generate the JMeter Plan</w:t>
       </w:r>
     </w:p>
     <w:p>
@@ -3515,7 +4920,7 @@
         <w:drawing>
           <wp:inline xmlns:a="http://schemas.openxmlformats.org/drawingml/2006/main" xmlns:pic="http://schemas.openxmlformats.org/drawingml/2006/picture">
             <wp:extent cx="5212080" cy="2812869"/>
-            <wp:docPr id="3" name="Picture 3" descr="Baseline11 Generate page showing one accepted correlation, three downstream substitutions, JMX download, and Authorization validation input"/>
+            <wp:docPr id="9" name="Picture 9" descr="Baseline11 Generate page showing one accepted correlation, three downstream substitutions, JMX download, and Authorization validation input"/>
             <wp:cNvGraphicFramePr>
               <a:graphicFrameLocks noChangeAspect="1"/>
             </wp:cNvGraphicFramePr>
@@ -3527,7 +4932,7 @@
                     <pic:cNvPicPr/>
                   </pic:nvPicPr>
                   <pic:blipFill>
-                    <a:blip r:embed="rId12"/>
+                    <a:blip r:embed="rId18"/>
                     <a:stretch>
                       <a:fillRect/>
                     </a:stretch>
@@ -3557,7 +4962,7 @@
           <w:color w:val="555555"/>
           <w:sz w:val="17"/>
         </w:rPr>
-        <w:t>Figure 3  Generated JMX summary and runtime Authorization property required for validation</w:t>
+        <w:t>Figure 9  Generated JMX summary and runtime Authorization property required for validation</w:t>
       </w:r>
     </w:p>
     <w:p>
@@ -3614,16 +5019,11 @@
       </w:r>
     </w:p>
     <w:p>
-      <w:r>
-        <w:br w:type="page"/>
-      </w:r>
-    </w:p>
-    <w:p>
       <w:pPr>
         <w:pStyle w:val="Heading1"/>
       </w:pPr>
       <w:r>
-        <w:t>6 Validate with Apache JMeter 5.6.3</w:t>
+        <w:t>7 Validate with Apache JMeter 5.6.3</w:t>
       </w:r>
     </w:p>
     <w:p>
@@ -3861,16 +5261,11 @@
       </w:r>
     </w:p>
     <w:p>
-      <w:r>
-        <w:br w:type="page"/>
-      </w:r>
-    </w:p>
-    <w:p>
       <w:pPr>
         <w:pStyle w:val="Heading1"/>
       </w:pPr>
       <w:r>
-        <w:t>7 Package the Deliverables</w:t>
+        <w:t>8 Package the Deliverables</w:t>
       </w:r>
     </w:p>
     <w:p>
@@ -4629,16 +6024,11 @@
       </w:r>
     </w:p>
     <w:p>
-      <w:r>
-        <w:br w:type="page"/>
-      </w:r>
-    </w:p>
-    <w:p>
       <w:pPr>
         <w:pStyle w:val="Heading1"/>
       </w:pPr>
       <w:r>
-        <w:t>8 Troubleshooting</w:t>
+        <w:t>9 Troubleshooting</w:t>
       </w:r>
     </w:p>
     <w:tbl>
@@ -5402,6 +6792,11 @@
       </w:pPr>
     </w:p>
     <w:p>
+      <w:r>
+        <w:t>For failures of the collection run itself, see the code table in section 1.</w:t>
+      </w:r>
+    </w:p>
+    <w:p>
       <w:pPr>
         <w:pStyle w:val="Heading2"/>
       </w:pPr>
@@ -5415,7 +6810,7 @@
         <w:spacing w:after="40"/>
       </w:pPr>
       <w:r>
-        <w:t>[ ] Collection completes successfully in Newman.</w:t>
+        <w:t>[ ] Collection completes successfully (run in Baseline11, or twice in Newman for advanced mode).</w:t>
       </w:r>
     </w:p>
     <w:p>
@@ -5424,7 +6819,7 @@
         <w:spacing w:after="40"/>
       </w:pPr>
       <w:r>
-        <w:t>[ ] Baseline and comparison JSON reports were generated from the same scenario.</w:t>
+        <w:t>[ ] Both runs came from the same collection, folder and starting values.</w:t>
       </w:r>
     </w:p>
     <w:p>
@@ -6446,6 +7841,7 @@
     <w:pPr>
       <w:keepNext/>
       <w:keepLines/>
+      <w:pageBreakBefore/>
       <w:spacing w:before="280" w:after="140"/>
       <w:outlineLvl w:val="0"/>
     </w:pPr>
@@ -6470,6 +7866,7 @@
     <w:pPr>
       <w:keepNext/>
       <w:keepLines/>
+      <w:pageBreakBefore w:val="0"/>
       <w:spacing w:before="200" w:after="100"/>
       <w:outlineLvl w:val="1"/>
     </w:pPr>
@@ -6494,6 +7891,7 @@
     <w:pPr>
       <w:keepNext/>
       <w:keepLines/>
+      <w:pageBreakBefore w:val="0"/>
       <w:spacing w:before="160" w:after="60"/>
       <w:outlineLvl w:val="2"/>
     </w:pPr>
@@ -6734,6 +8132,7 @@
     <w:rsid w:val="00FC693F"/>
     <w:pPr>
       <w:keepNext/>
+      <w:pageBreakBefore w:val="0"/>
       <w:spacing w:after="320" w:line="240" w:lineRule="auto" w:before="0"/>
       <w:contextualSpacing/>
     </w:pPr>

</xml_diff>